<commit_message>
Add Week 7 reflection QMD source and compiled DOCX
</commit_message>
<xml_diff>
--- a/reflection77.docx
+++ b/reflection77.docx
@@ -125,13 +125,19 @@
         <w:pStyle w:val="Author"/>
       </w:pPr>
       <w:r>
-        <w:t xml:space="preserve">Graduate</w:t>
-      </w:r>
-      <w:r>
-        <w:t xml:space="preserve"> </w:t>
-      </w:r>
-      <w:r>
-        <w:t xml:space="preserve">Student</w:t>
+        <w:t xml:space="preserve">Halson</w:t>
+      </w:r>
+      <w:r>
+        <w:t xml:space="preserve"> </w:t>
+      </w:r>
+      <w:r>
+        <w:t xml:space="preserve">Ogeto</w:t>
+      </w:r>
+      <w:r>
+        <w:t xml:space="preserve"> </w:t>
+      </w:r>
+      <w:r>
+        <w:t xml:space="preserve">Nyaberi</w:t>
       </w:r>
     </w:p>
     <w:p>

</xml_diff>